<commit_message>
using the 2023 ebird data
</commit_message>
<xml_diff>
--- a/Analysis_support_document.docx
+++ b/Analysis_support_document.docx
@@ -93,7 +93,36 @@
           <w:sz w:val="20"/>
           <w:szCs w:val="20"/>
         </w:rPr>
-        <w:t xml:space="preserve">Once we exclude those species that are not "conservation contributors" then we have 338 species </w:t>
+        <w:t xml:space="preserve">Once we exclude those species that are not "conservation contributors" then we have </w:t>
+      </w:r>
+      <w:r>
+        <w:rPr>
+          <w:sz w:val="20"/>
+          <w:szCs w:val="20"/>
+          <w:highlight w:val="yellow"/>
+        </w:rPr>
+        <w:t>338</w:t>
+      </w:r>
+      <w:r>
+        <w:rPr>
+          <w:sz w:val="20"/>
+          <w:szCs w:val="20"/>
+        </w:rPr>
+        <w:t xml:space="preserve"> </w:t>
+      </w:r>
+      <w:r>
+        <w:rPr>
+          <w:sz w:val="20"/>
+          <w:szCs w:val="20"/>
+        </w:rPr>
+        <w:t xml:space="preserve">353 </w:t>
+      </w:r>
+      <w:r>
+        <w:rPr>
+          <w:sz w:val="20"/>
+          <w:szCs w:val="20"/>
+        </w:rPr>
+        <w:t xml:space="preserve">species </w:t>
       </w:r>
     </w:p>
     <w:p>
@@ -189,7 +218,37 @@
           <w:sz w:val="20"/>
           <w:szCs w:val="20"/>
         </w:rPr>
-        <w:t xml:space="preserve"># Of those 338 species, we have </w:t>
+        <w:t xml:space="preserve"># Of those </w:t>
+      </w:r>
+      <w:proofErr w:type="gramStart"/>
+      <w:r>
+        <w:rPr>
+          <w:sz w:val="20"/>
+          <w:szCs w:val="20"/>
+        </w:rPr>
+        <w:t>3</w:t>
+      </w:r>
+      <w:r>
+        <w:rPr>
+          <w:sz w:val="20"/>
+          <w:szCs w:val="20"/>
+        </w:rPr>
+        <w:t xml:space="preserve">53 </w:t>
+      </w:r>
+      <w:r>
+        <w:rPr>
+          <w:sz w:val="20"/>
+          <w:szCs w:val="20"/>
+        </w:rPr>
+        <w:t xml:space="preserve"> species</w:t>
+      </w:r>
+      <w:proofErr w:type="gramEnd"/>
+      <w:r>
+        <w:rPr>
+          <w:sz w:val="20"/>
+          <w:szCs w:val="20"/>
+        </w:rPr>
+        <w:t xml:space="preserve">, we have </w:t>
       </w:r>
       <w:proofErr w:type="spellStart"/>
       <w:r>
@@ -205,15 +264,14 @@
           <w:sz w:val="20"/>
           <w:szCs w:val="20"/>
         </w:rPr>
-        <w:t xml:space="preserve"> data for </w:t>
+        <w:t xml:space="preserve"> data for 3</w:t>
       </w:r>
-      <w:proofErr w:type="gramStart"/>
       <w:r>
         <w:rPr>
           <w:sz w:val="20"/>
           <w:szCs w:val="20"/>
         </w:rPr>
-        <w:t>310</w:t>
+        <w:t>09</w:t>
       </w:r>
       <w:r>
         <w:rPr>
@@ -222,7 +280,21 @@
         </w:rPr>
         <w:t>,</w:t>
       </w:r>
-      <w:proofErr w:type="gramEnd"/>
+      <w:r>
+        <w:rPr>
+          <w:sz w:val="20"/>
+          <w:szCs w:val="20"/>
+        </w:rPr>
+        <w:t xml:space="preserve"> we don have for </w:t>
+      </w:r>
+      <w:proofErr w:type="gramStart"/>
+      <w:r>
+        <w:rPr>
+          <w:sz w:val="20"/>
+          <w:szCs w:val="20"/>
+        </w:rPr>
+        <w:t xml:space="preserve">44 </w:t>
+      </w:r>
       <w:r>
         <w:rPr>
           <w:sz w:val="20"/>
@@ -235,7 +307,15 @@
           <w:sz w:val="20"/>
           <w:szCs w:val="20"/>
         </w:rPr>
-        <w:t xml:space="preserve">of </w:t>
+        <w:t>of</w:t>
+      </w:r>
+      <w:proofErr w:type="gramEnd"/>
+      <w:r>
+        <w:rPr>
+          <w:sz w:val="20"/>
+          <w:szCs w:val="20"/>
+        </w:rPr>
+        <w:t xml:space="preserve"> </w:t>
       </w:r>
       <w:proofErr w:type="gramStart"/>
       <w:r>
@@ -251,17 +331,15 @@
           <w:sz w:val="20"/>
           <w:szCs w:val="20"/>
         </w:rPr>
-        <w:t xml:space="preserve"> 275 are flagged as non-</w:t>
+        <w:t xml:space="preserve"> 275 are flagged as non-resident</w:t>
       </w:r>
-      <w:proofErr w:type="spellStart"/>
       <w:r>
         <w:rPr>
           <w:sz w:val="20"/>
           <w:szCs w:val="20"/>
         </w:rPr>
-        <w:t>residentare</w:t>
+        <w:t>s</w:t>
       </w:r>
-      <w:proofErr w:type="spellEnd"/>
       <w:r>
         <w:rPr>
           <w:sz w:val="20"/>
@@ -57872,6 +57950,2756 @@
         </w:tc>
       </w:tr>
     </w:tbl>
+    <w:p/>
+    <w:p/>
+    <w:p/>
+    <w:p>
+      <w:r>
+        <w:t xml:space="preserve">Table 2. </w:t>
+      </w:r>
+      <w:proofErr w:type="spellStart"/>
+      <w:r>
+        <w:t>Bc</w:t>
+      </w:r>
+      <w:proofErr w:type="spellEnd"/>
+      <w:r>
+        <w:t xml:space="preserve"> species without </w:t>
+      </w:r>
+      <w:proofErr w:type="spellStart"/>
+      <w:r>
+        <w:t>ebird</w:t>
+      </w:r>
+      <w:proofErr w:type="spellEnd"/>
+      <w:r>
+        <w:t xml:space="preserve"> data </w:t>
+      </w:r>
+    </w:p>
+    <w:tbl>
+      <w:tblPr>
+        <w:tblStyle w:val="TableGrid"/>
+        <w:tblW w:w="0" w:type="auto"/>
+        <w:tblLook w:val="04A0" w:firstRow="1" w:lastRow="0" w:firstColumn="1" w:lastColumn="0" w:noHBand="0" w:noVBand="1"/>
+      </w:tblPr>
+      <w:tblGrid>
+        <w:gridCol w:w="3938"/>
+        <w:gridCol w:w="3976"/>
+        <w:gridCol w:w="1295"/>
+        <w:gridCol w:w="1270"/>
+      </w:tblGrid>
+      <w:tr>
+        <w:trPr>
+          <w:trHeight w:val="288"/>
+        </w:trPr>
+        <w:tc>
+          <w:tcPr>
+            <w:tcW w:w="4120" w:type="dxa"/>
+            <w:noWrap/>
+            <w:hideMark/>
+          </w:tcPr>
+          <w:p>
+            <w:proofErr w:type="spellStart"/>
+            <w:r>
+              <w:t>common_name</w:t>
+            </w:r>
+            <w:proofErr w:type="spellEnd"/>
+          </w:p>
+        </w:tc>
+        <w:tc>
+          <w:tcPr>
+            <w:tcW w:w="4160" w:type="dxa"/>
+            <w:noWrap/>
+            <w:hideMark/>
+          </w:tcPr>
+          <w:p>
+            <w:proofErr w:type="spellStart"/>
+            <w:r>
+              <w:t>sci_name</w:t>
+            </w:r>
+            <w:proofErr w:type="spellEnd"/>
+          </w:p>
+        </w:tc>
+        <w:tc>
+          <w:tcPr>
+            <w:tcW w:w="987" w:type="dxa"/>
+            <w:noWrap/>
+            <w:hideMark/>
+          </w:tcPr>
+          <w:p>
+            <w:proofErr w:type="spellStart"/>
+            <w:r>
+              <w:t>is_resident</w:t>
+            </w:r>
+            <w:proofErr w:type="spellEnd"/>
+          </w:p>
+        </w:tc>
+        <w:tc>
+          <w:tcPr>
+            <w:tcW w:w="965" w:type="dxa"/>
+            <w:noWrap/>
+            <w:hideMark/>
+          </w:tcPr>
+          <w:p>
+            <w:proofErr w:type="spellStart"/>
+            <w:r>
+              <w:t>ebird_data</w:t>
+            </w:r>
+            <w:proofErr w:type="spellEnd"/>
+          </w:p>
+        </w:tc>
+      </w:tr>
+      <w:tr>
+        <w:trPr>
+          <w:trHeight w:val="288"/>
+        </w:trPr>
+        <w:tc>
+          <w:tcPr>
+            <w:tcW w:w="4120" w:type="dxa"/>
+            <w:noWrap/>
+            <w:hideMark/>
+          </w:tcPr>
+          <w:p>
+            <w:r>
+              <w:t>American Barn Owl</w:t>
+            </w:r>
+          </w:p>
+        </w:tc>
+        <w:tc>
+          <w:tcPr>
+            <w:tcW w:w="4160" w:type="dxa"/>
+            <w:noWrap/>
+            <w:hideMark/>
+          </w:tcPr>
+          <w:p>
+            <w:r>
+              <w:t>Tyto furcata</w:t>
+            </w:r>
+          </w:p>
+        </w:tc>
+        <w:tc>
+          <w:tcPr>
+            <w:tcW w:w="987" w:type="dxa"/>
+            <w:noWrap/>
+            <w:hideMark/>
+          </w:tcPr>
+          <w:p>
+            <w:r>
+              <w:t>NA</w:t>
+            </w:r>
+          </w:p>
+        </w:tc>
+        <w:tc>
+          <w:tcPr>
+            <w:tcW w:w="965" w:type="dxa"/>
+            <w:noWrap/>
+            <w:hideMark/>
+          </w:tcPr>
+          <w:p>
+            <w:r>
+              <w:t>no</w:t>
+            </w:r>
+          </w:p>
+        </w:tc>
+      </w:tr>
+      <w:tr>
+        <w:trPr>
+          <w:trHeight w:val="288"/>
+        </w:trPr>
+        <w:tc>
+          <w:tcPr>
+            <w:tcW w:w="4120" w:type="dxa"/>
+            <w:noWrap/>
+            <w:hideMark/>
+          </w:tcPr>
+          <w:p>
+            <w:r>
+              <w:t>American Herring Gull</w:t>
+            </w:r>
+          </w:p>
+        </w:tc>
+        <w:tc>
+          <w:tcPr>
+            <w:tcW w:w="4160" w:type="dxa"/>
+            <w:noWrap/>
+            <w:hideMark/>
+          </w:tcPr>
+          <w:p>
+            <w:r>
+              <w:t xml:space="preserve">Larus </w:t>
+            </w:r>
+            <w:proofErr w:type="spellStart"/>
+            <w:r>
+              <w:t>smithsonianus</w:t>
+            </w:r>
+            <w:proofErr w:type="spellEnd"/>
+          </w:p>
+        </w:tc>
+        <w:tc>
+          <w:tcPr>
+            <w:tcW w:w="987" w:type="dxa"/>
+            <w:noWrap/>
+            <w:hideMark/>
+          </w:tcPr>
+          <w:p>
+            <w:r>
+              <w:t>NA</w:t>
+            </w:r>
+          </w:p>
+        </w:tc>
+        <w:tc>
+          <w:tcPr>
+            <w:tcW w:w="965" w:type="dxa"/>
+            <w:noWrap/>
+            <w:hideMark/>
+          </w:tcPr>
+          <w:p>
+            <w:r>
+              <w:t>no</w:t>
+            </w:r>
+          </w:p>
+        </w:tc>
+      </w:tr>
+      <w:tr>
+        <w:trPr>
+          <w:trHeight w:val="288"/>
+        </w:trPr>
+        <w:tc>
+          <w:tcPr>
+            <w:tcW w:w="4120" w:type="dxa"/>
+            <w:noWrap/>
+            <w:hideMark/>
+          </w:tcPr>
+          <w:p>
+            <w:r>
+              <w:t>Ancient Murrelet</w:t>
+            </w:r>
+          </w:p>
+        </w:tc>
+        <w:tc>
+          <w:tcPr>
+            <w:tcW w:w="4160" w:type="dxa"/>
+            <w:noWrap/>
+            <w:hideMark/>
+          </w:tcPr>
+          <w:p>
+            <w:proofErr w:type="spellStart"/>
+            <w:r>
+              <w:t>Synthliboramphus</w:t>
+            </w:r>
+            <w:proofErr w:type="spellEnd"/>
+            <w:r>
+              <w:t xml:space="preserve"> </w:t>
+            </w:r>
+            <w:proofErr w:type="spellStart"/>
+            <w:r>
+              <w:t>antiquus</w:t>
+            </w:r>
+            <w:proofErr w:type="spellEnd"/>
+          </w:p>
+        </w:tc>
+        <w:tc>
+          <w:tcPr>
+            <w:tcW w:w="987" w:type="dxa"/>
+            <w:noWrap/>
+            <w:hideMark/>
+          </w:tcPr>
+          <w:p>
+            <w:r>
+              <w:t>NA</w:t>
+            </w:r>
+          </w:p>
+        </w:tc>
+        <w:tc>
+          <w:tcPr>
+            <w:tcW w:w="965" w:type="dxa"/>
+            <w:noWrap/>
+            <w:hideMark/>
+          </w:tcPr>
+          <w:p>
+            <w:r>
+              <w:t>no</w:t>
+            </w:r>
+          </w:p>
+        </w:tc>
+      </w:tr>
+      <w:tr>
+        <w:trPr>
+          <w:trHeight w:val="288"/>
+        </w:trPr>
+        <w:tc>
+          <w:tcPr>
+            <w:tcW w:w="4120" w:type="dxa"/>
+            <w:noWrap/>
+            <w:hideMark/>
+          </w:tcPr>
+          <w:p>
+            <w:r>
+              <w:t>Black-footed Albatross</w:t>
+            </w:r>
+          </w:p>
+        </w:tc>
+        <w:tc>
+          <w:tcPr>
+            <w:tcW w:w="4160" w:type="dxa"/>
+            <w:noWrap/>
+            <w:hideMark/>
+          </w:tcPr>
+          <w:p>
+            <w:proofErr w:type="spellStart"/>
+            <w:r>
+              <w:t>Phoebastria</w:t>
+            </w:r>
+            <w:proofErr w:type="spellEnd"/>
+            <w:r>
+              <w:t xml:space="preserve"> nigripes</w:t>
+            </w:r>
+          </w:p>
+        </w:tc>
+        <w:tc>
+          <w:tcPr>
+            <w:tcW w:w="987" w:type="dxa"/>
+            <w:noWrap/>
+            <w:hideMark/>
+          </w:tcPr>
+          <w:p>
+            <w:r>
+              <w:t>NA</w:t>
+            </w:r>
+          </w:p>
+        </w:tc>
+        <w:tc>
+          <w:tcPr>
+            <w:tcW w:w="965" w:type="dxa"/>
+            <w:noWrap/>
+            <w:hideMark/>
+          </w:tcPr>
+          <w:p>
+            <w:r>
+              <w:t>no</w:t>
+            </w:r>
+          </w:p>
+        </w:tc>
+      </w:tr>
+      <w:tr>
+        <w:trPr>
+          <w:trHeight w:val="288"/>
+        </w:trPr>
+        <w:tc>
+          <w:tcPr>
+            <w:tcW w:w="4120" w:type="dxa"/>
+            <w:noWrap/>
+            <w:hideMark/>
+          </w:tcPr>
+          <w:p>
+            <w:r>
+              <w:t>Black-legged Kittiwake</w:t>
+            </w:r>
+          </w:p>
+        </w:tc>
+        <w:tc>
+          <w:tcPr>
+            <w:tcW w:w="4160" w:type="dxa"/>
+            <w:noWrap/>
+            <w:hideMark/>
+          </w:tcPr>
+          <w:p>
+            <w:r>
+              <w:t>Rissa tridactyla</w:t>
+            </w:r>
+          </w:p>
+        </w:tc>
+        <w:tc>
+          <w:tcPr>
+            <w:tcW w:w="987" w:type="dxa"/>
+            <w:noWrap/>
+            <w:hideMark/>
+          </w:tcPr>
+          <w:p>
+            <w:r>
+              <w:t>NA</w:t>
+            </w:r>
+          </w:p>
+        </w:tc>
+        <w:tc>
+          <w:tcPr>
+            <w:tcW w:w="965" w:type="dxa"/>
+            <w:noWrap/>
+            <w:hideMark/>
+          </w:tcPr>
+          <w:p>
+            <w:r>
+              <w:t>no</w:t>
+            </w:r>
+          </w:p>
+        </w:tc>
+      </w:tr>
+      <w:tr>
+        <w:trPr>
+          <w:trHeight w:val="288"/>
+        </w:trPr>
+        <w:tc>
+          <w:tcPr>
+            <w:tcW w:w="4120" w:type="dxa"/>
+            <w:noWrap/>
+            <w:hideMark/>
+          </w:tcPr>
+          <w:p>
+            <w:r>
+              <w:t>Boreal Owl</w:t>
+            </w:r>
+          </w:p>
+        </w:tc>
+        <w:tc>
+          <w:tcPr>
+            <w:tcW w:w="4160" w:type="dxa"/>
+            <w:noWrap/>
+            <w:hideMark/>
+          </w:tcPr>
+          <w:p>
+            <w:r>
+              <w:t xml:space="preserve">Aegolius </w:t>
+            </w:r>
+            <w:proofErr w:type="spellStart"/>
+            <w:r>
+              <w:t>funereus</w:t>
+            </w:r>
+            <w:proofErr w:type="spellEnd"/>
+          </w:p>
+        </w:tc>
+        <w:tc>
+          <w:tcPr>
+            <w:tcW w:w="987" w:type="dxa"/>
+            <w:noWrap/>
+            <w:hideMark/>
+          </w:tcPr>
+          <w:p>
+            <w:r>
+              <w:t>NA</w:t>
+            </w:r>
+          </w:p>
+        </w:tc>
+        <w:tc>
+          <w:tcPr>
+            <w:tcW w:w="965" w:type="dxa"/>
+            <w:noWrap/>
+            <w:hideMark/>
+          </w:tcPr>
+          <w:p>
+            <w:r>
+              <w:t>no</w:t>
+            </w:r>
+          </w:p>
+        </w:tc>
+      </w:tr>
+      <w:tr>
+        <w:trPr>
+          <w:trHeight w:val="288"/>
+        </w:trPr>
+        <w:tc>
+          <w:tcPr>
+            <w:tcW w:w="4120" w:type="dxa"/>
+            <w:noWrap/>
+            <w:hideMark/>
+          </w:tcPr>
+          <w:p>
+            <w:r>
+              <w:t>Buller's Shearwater</w:t>
+            </w:r>
+          </w:p>
+        </w:tc>
+        <w:tc>
+          <w:tcPr>
+            <w:tcW w:w="4160" w:type="dxa"/>
+            <w:noWrap/>
+            <w:hideMark/>
+          </w:tcPr>
+          <w:p>
+            <w:proofErr w:type="spellStart"/>
+            <w:r>
+              <w:t>Ardenna</w:t>
+            </w:r>
+            <w:proofErr w:type="spellEnd"/>
+            <w:r>
+              <w:t xml:space="preserve"> </w:t>
+            </w:r>
+            <w:proofErr w:type="spellStart"/>
+            <w:r>
+              <w:t>bulleri</w:t>
+            </w:r>
+            <w:proofErr w:type="spellEnd"/>
+          </w:p>
+        </w:tc>
+        <w:tc>
+          <w:tcPr>
+            <w:tcW w:w="987" w:type="dxa"/>
+            <w:noWrap/>
+            <w:hideMark/>
+          </w:tcPr>
+          <w:p>
+            <w:r>
+              <w:t>NA</w:t>
+            </w:r>
+          </w:p>
+        </w:tc>
+        <w:tc>
+          <w:tcPr>
+            <w:tcW w:w="965" w:type="dxa"/>
+            <w:noWrap/>
+            <w:hideMark/>
+          </w:tcPr>
+          <w:p>
+            <w:r>
+              <w:t>no</w:t>
+            </w:r>
+          </w:p>
+        </w:tc>
+      </w:tr>
+      <w:tr>
+        <w:trPr>
+          <w:trHeight w:val="288"/>
+        </w:trPr>
+        <w:tc>
+          <w:tcPr>
+            <w:tcW w:w="4120" w:type="dxa"/>
+            <w:noWrap/>
+            <w:hideMark/>
+          </w:tcPr>
+          <w:p>
+            <w:r>
+              <w:t>Cassin's Auklet</w:t>
+            </w:r>
+          </w:p>
+        </w:tc>
+        <w:tc>
+          <w:tcPr>
+            <w:tcW w:w="4160" w:type="dxa"/>
+            <w:noWrap/>
+            <w:hideMark/>
+          </w:tcPr>
+          <w:p>
+            <w:proofErr w:type="spellStart"/>
+            <w:r>
+              <w:t>Ptychoramphus</w:t>
+            </w:r>
+            <w:proofErr w:type="spellEnd"/>
+            <w:r>
+              <w:t xml:space="preserve"> </w:t>
+            </w:r>
+            <w:proofErr w:type="spellStart"/>
+            <w:r>
+              <w:t>aleuticus</w:t>
+            </w:r>
+            <w:proofErr w:type="spellEnd"/>
+          </w:p>
+        </w:tc>
+        <w:tc>
+          <w:tcPr>
+            <w:tcW w:w="987" w:type="dxa"/>
+            <w:noWrap/>
+            <w:hideMark/>
+          </w:tcPr>
+          <w:p>
+            <w:r>
+              <w:t>NA</w:t>
+            </w:r>
+          </w:p>
+        </w:tc>
+        <w:tc>
+          <w:tcPr>
+            <w:tcW w:w="965" w:type="dxa"/>
+            <w:noWrap/>
+            <w:hideMark/>
+          </w:tcPr>
+          <w:p>
+            <w:r>
+              <w:t>no</w:t>
+            </w:r>
+          </w:p>
+        </w:tc>
+      </w:tr>
+      <w:tr>
+        <w:trPr>
+          <w:trHeight w:val="288"/>
+        </w:trPr>
+        <w:tc>
+          <w:tcPr>
+            <w:tcW w:w="4120" w:type="dxa"/>
+            <w:noWrap/>
+            <w:hideMark/>
+          </w:tcPr>
+          <w:p>
+            <w:r>
+              <w:lastRenderedPageBreak/>
+              <w:t>Common Murre</w:t>
+            </w:r>
+          </w:p>
+        </w:tc>
+        <w:tc>
+          <w:tcPr>
+            <w:tcW w:w="4160" w:type="dxa"/>
+            <w:noWrap/>
+            <w:hideMark/>
+          </w:tcPr>
+          <w:p>
+            <w:r>
+              <w:t xml:space="preserve">Uria </w:t>
+            </w:r>
+            <w:proofErr w:type="spellStart"/>
+            <w:r>
+              <w:t>aalge</w:t>
+            </w:r>
+            <w:proofErr w:type="spellEnd"/>
+          </w:p>
+        </w:tc>
+        <w:tc>
+          <w:tcPr>
+            <w:tcW w:w="987" w:type="dxa"/>
+            <w:noWrap/>
+            <w:hideMark/>
+          </w:tcPr>
+          <w:p>
+            <w:r>
+              <w:t>NA</w:t>
+            </w:r>
+          </w:p>
+        </w:tc>
+        <w:tc>
+          <w:tcPr>
+            <w:tcW w:w="965" w:type="dxa"/>
+            <w:noWrap/>
+            <w:hideMark/>
+          </w:tcPr>
+          <w:p>
+            <w:r>
+              <w:t>no</w:t>
+            </w:r>
+          </w:p>
+        </w:tc>
+      </w:tr>
+      <w:tr>
+        <w:trPr>
+          <w:trHeight w:val="288"/>
+        </w:trPr>
+        <w:tc>
+          <w:tcPr>
+            <w:tcW w:w="4120" w:type="dxa"/>
+            <w:noWrap/>
+            <w:hideMark/>
+          </w:tcPr>
+          <w:p>
+            <w:r>
+              <w:t>Curlew Sandpiper</w:t>
+            </w:r>
+          </w:p>
+        </w:tc>
+        <w:tc>
+          <w:tcPr>
+            <w:tcW w:w="4160" w:type="dxa"/>
+            <w:noWrap/>
+            <w:hideMark/>
+          </w:tcPr>
+          <w:p>
+            <w:r>
+              <w:t xml:space="preserve">Calidris </w:t>
+            </w:r>
+            <w:proofErr w:type="spellStart"/>
+            <w:r>
+              <w:t>ferruginea</w:t>
+            </w:r>
+            <w:proofErr w:type="spellEnd"/>
+          </w:p>
+        </w:tc>
+        <w:tc>
+          <w:tcPr>
+            <w:tcW w:w="987" w:type="dxa"/>
+            <w:noWrap/>
+            <w:hideMark/>
+          </w:tcPr>
+          <w:p>
+            <w:r>
+              <w:t>NA</w:t>
+            </w:r>
+          </w:p>
+        </w:tc>
+        <w:tc>
+          <w:tcPr>
+            <w:tcW w:w="965" w:type="dxa"/>
+            <w:noWrap/>
+            <w:hideMark/>
+          </w:tcPr>
+          <w:p>
+            <w:r>
+              <w:t>no</w:t>
+            </w:r>
+          </w:p>
+        </w:tc>
+      </w:tr>
+      <w:tr>
+        <w:trPr>
+          <w:trHeight w:val="288"/>
+        </w:trPr>
+        <w:tc>
+          <w:tcPr>
+            <w:tcW w:w="4120" w:type="dxa"/>
+            <w:noWrap/>
+            <w:hideMark/>
+          </w:tcPr>
+          <w:p>
+            <w:r>
+              <w:t>Eurasian Wigeon</w:t>
+            </w:r>
+          </w:p>
+        </w:tc>
+        <w:tc>
+          <w:tcPr>
+            <w:tcW w:w="4160" w:type="dxa"/>
+            <w:noWrap/>
+            <w:hideMark/>
+          </w:tcPr>
+          <w:p>
+            <w:proofErr w:type="spellStart"/>
+            <w:r>
+              <w:t>Mareca</w:t>
+            </w:r>
+            <w:proofErr w:type="spellEnd"/>
+            <w:r>
+              <w:t xml:space="preserve"> </w:t>
+            </w:r>
+            <w:proofErr w:type="spellStart"/>
+            <w:r>
+              <w:t>penelope</w:t>
+            </w:r>
+            <w:proofErr w:type="spellEnd"/>
+          </w:p>
+        </w:tc>
+        <w:tc>
+          <w:tcPr>
+            <w:tcW w:w="987" w:type="dxa"/>
+            <w:noWrap/>
+            <w:hideMark/>
+          </w:tcPr>
+          <w:p>
+            <w:r>
+              <w:t>NA</w:t>
+            </w:r>
+          </w:p>
+        </w:tc>
+        <w:tc>
+          <w:tcPr>
+            <w:tcW w:w="965" w:type="dxa"/>
+            <w:noWrap/>
+            <w:hideMark/>
+          </w:tcPr>
+          <w:p>
+            <w:r>
+              <w:t>no</w:t>
+            </w:r>
+          </w:p>
+        </w:tc>
+      </w:tr>
+      <w:tr>
+        <w:trPr>
+          <w:trHeight w:val="288"/>
+        </w:trPr>
+        <w:tc>
+          <w:tcPr>
+            <w:tcW w:w="4120" w:type="dxa"/>
+            <w:noWrap/>
+            <w:hideMark/>
+          </w:tcPr>
+          <w:p>
+            <w:r>
+              <w:t>Flesh-footed Shearwater</w:t>
+            </w:r>
+          </w:p>
+        </w:tc>
+        <w:tc>
+          <w:tcPr>
+            <w:tcW w:w="4160" w:type="dxa"/>
+            <w:noWrap/>
+            <w:hideMark/>
+          </w:tcPr>
+          <w:p>
+            <w:proofErr w:type="spellStart"/>
+            <w:r>
+              <w:t>Ardenna</w:t>
+            </w:r>
+            <w:proofErr w:type="spellEnd"/>
+            <w:r>
+              <w:t xml:space="preserve"> </w:t>
+            </w:r>
+            <w:proofErr w:type="spellStart"/>
+            <w:r>
+              <w:t>carneipes</w:t>
+            </w:r>
+            <w:proofErr w:type="spellEnd"/>
+          </w:p>
+        </w:tc>
+        <w:tc>
+          <w:tcPr>
+            <w:tcW w:w="987" w:type="dxa"/>
+            <w:noWrap/>
+            <w:hideMark/>
+          </w:tcPr>
+          <w:p>
+            <w:r>
+              <w:t>NA</w:t>
+            </w:r>
+          </w:p>
+        </w:tc>
+        <w:tc>
+          <w:tcPr>
+            <w:tcW w:w="965" w:type="dxa"/>
+            <w:noWrap/>
+            <w:hideMark/>
+          </w:tcPr>
+          <w:p>
+            <w:r>
+              <w:t>no</w:t>
+            </w:r>
+          </w:p>
+        </w:tc>
+      </w:tr>
+      <w:tr>
+        <w:trPr>
+          <w:trHeight w:val="288"/>
+        </w:trPr>
+        <w:tc>
+          <w:tcPr>
+            <w:tcW w:w="4120" w:type="dxa"/>
+            <w:noWrap/>
+            <w:hideMark/>
+          </w:tcPr>
+          <w:p>
+            <w:r>
+              <w:t>Fork-tailed Storm-Petrel</w:t>
+            </w:r>
+          </w:p>
+        </w:tc>
+        <w:tc>
+          <w:tcPr>
+            <w:tcW w:w="4160" w:type="dxa"/>
+            <w:noWrap/>
+            <w:hideMark/>
+          </w:tcPr>
+          <w:p>
+            <w:proofErr w:type="spellStart"/>
+            <w:r>
+              <w:t>Hydrobates</w:t>
+            </w:r>
+            <w:proofErr w:type="spellEnd"/>
+            <w:r>
+              <w:t xml:space="preserve"> furcatus</w:t>
+            </w:r>
+          </w:p>
+        </w:tc>
+        <w:tc>
+          <w:tcPr>
+            <w:tcW w:w="987" w:type="dxa"/>
+            <w:noWrap/>
+            <w:hideMark/>
+          </w:tcPr>
+          <w:p>
+            <w:r>
+              <w:t>NA</w:t>
+            </w:r>
+          </w:p>
+        </w:tc>
+        <w:tc>
+          <w:tcPr>
+            <w:tcW w:w="965" w:type="dxa"/>
+            <w:noWrap/>
+            <w:hideMark/>
+          </w:tcPr>
+          <w:p>
+            <w:r>
+              <w:t>no</w:t>
+            </w:r>
+          </w:p>
+        </w:tc>
+      </w:tr>
+      <w:tr>
+        <w:trPr>
+          <w:trHeight w:val="288"/>
+        </w:trPr>
+        <w:tc>
+          <w:tcPr>
+            <w:tcW w:w="4120" w:type="dxa"/>
+            <w:noWrap/>
+            <w:hideMark/>
+          </w:tcPr>
+          <w:p>
+            <w:r>
+              <w:t>Great Gray Owl</w:t>
+            </w:r>
+          </w:p>
+        </w:tc>
+        <w:tc>
+          <w:tcPr>
+            <w:tcW w:w="4160" w:type="dxa"/>
+            <w:noWrap/>
+            <w:hideMark/>
+          </w:tcPr>
+          <w:p>
+            <w:r>
+              <w:t>Strix nebulosa</w:t>
+            </w:r>
+          </w:p>
+        </w:tc>
+        <w:tc>
+          <w:tcPr>
+            <w:tcW w:w="987" w:type="dxa"/>
+            <w:noWrap/>
+            <w:hideMark/>
+          </w:tcPr>
+          <w:p>
+            <w:r>
+              <w:t>NA</w:t>
+            </w:r>
+          </w:p>
+        </w:tc>
+        <w:tc>
+          <w:tcPr>
+            <w:tcW w:w="965" w:type="dxa"/>
+            <w:noWrap/>
+            <w:hideMark/>
+          </w:tcPr>
+          <w:p>
+            <w:r>
+              <w:t>no</w:t>
+            </w:r>
+          </w:p>
+        </w:tc>
+      </w:tr>
+      <w:tr>
+        <w:trPr>
+          <w:trHeight w:val="288"/>
+        </w:trPr>
+        <w:tc>
+          <w:tcPr>
+            <w:tcW w:w="4120" w:type="dxa"/>
+            <w:noWrap/>
+            <w:hideMark/>
+          </w:tcPr>
+          <w:p>
+            <w:r>
+              <w:t>Gyrfalcon</w:t>
+            </w:r>
+          </w:p>
+        </w:tc>
+        <w:tc>
+          <w:tcPr>
+            <w:tcW w:w="4160" w:type="dxa"/>
+            <w:noWrap/>
+            <w:hideMark/>
+          </w:tcPr>
+          <w:p>
+            <w:r>
+              <w:t xml:space="preserve">Falco </w:t>
+            </w:r>
+            <w:proofErr w:type="spellStart"/>
+            <w:r>
+              <w:t>rusticolus</w:t>
+            </w:r>
+            <w:proofErr w:type="spellEnd"/>
+          </w:p>
+        </w:tc>
+        <w:tc>
+          <w:tcPr>
+            <w:tcW w:w="987" w:type="dxa"/>
+            <w:noWrap/>
+            <w:hideMark/>
+          </w:tcPr>
+          <w:p>
+            <w:r>
+              <w:t>NA</w:t>
+            </w:r>
+          </w:p>
+        </w:tc>
+        <w:tc>
+          <w:tcPr>
+            <w:tcW w:w="965" w:type="dxa"/>
+            <w:noWrap/>
+            <w:hideMark/>
+          </w:tcPr>
+          <w:p>
+            <w:r>
+              <w:t>no</w:t>
+            </w:r>
+          </w:p>
+        </w:tc>
+      </w:tr>
+      <w:tr>
+        <w:trPr>
+          <w:trHeight w:val="288"/>
+        </w:trPr>
+        <w:tc>
+          <w:tcPr>
+            <w:tcW w:w="4120" w:type="dxa"/>
+            <w:noWrap/>
+            <w:hideMark/>
+          </w:tcPr>
+          <w:p>
+            <w:r>
+              <w:t>Horned Puffin</w:t>
+            </w:r>
+          </w:p>
+        </w:tc>
+        <w:tc>
+          <w:tcPr>
+            <w:tcW w:w="4160" w:type="dxa"/>
+            <w:noWrap/>
+            <w:hideMark/>
+          </w:tcPr>
+          <w:p>
+            <w:proofErr w:type="spellStart"/>
+            <w:r>
+              <w:t>Fratercula</w:t>
+            </w:r>
+            <w:proofErr w:type="spellEnd"/>
+            <w:r>
+              <w:t xml:space="preserve"> </w:t>
+            </w:r>
+            <w:proofErr w:type="spellStart"/>
+            <w:r>
+              <w:t>corniculata</w:t>
+            </w:r>
+            <w:proofErr w:type="spellEnd"/>
+          </w:p>
+        </w:tc>
+        <w:tc>
+          <w:tcPr>
+            <w:tcW w:w="987" w:type="dxa"/>
+            <w:noWrap/>
+            <w:hideMark/>
+          </w:tcPr>
+          <w:p>
+            <w:r>
+              <w:t>NA</w:t>
+            </w:r>
+          </w:p>
+        </w:tc>
+        <w:tc>
+          <w:tcPr>
+            <w:tcW w:w="965" w:type="dxa"/>
+            <w:noWrap/>
+            <w:hideMark/>
+          </w:tcPr>
+          <w:p>
+            <w:r>
+              <w:t>no</w:t>
+            </w:r>
+          </w:p>
+        </w:tc>
+      </w:tr>
+      <w:tr>
+        <w:trPr>
+          <w:trHeight w:val="288"/>
+        </w:trPr>
+        <w:tc>
+          <w:tcPr>
+            <w:tcW w:w="4120" w:type="dxa"/>
+            <w:noWrap/>
+            <w:hideMark/>
+          </w:tcPr>
+          <w:p>
+            <w:r>
+              <w:t>Hudsonian Whimbrel</w:t>
+            </w:r>
+          </w:p>
+        </w:tc>
+        <w:tc>
+          <w:tcPr>
+            <w:tcW w:w="4160" w:type="dxa"/>
+            <w:noWrap/>
+            <w:hideMark/>
+          </w:tcPr>
+          <w:p>
+            <w:r>
+              <w:t xml:space="preserve">Numenius </w:t>
+            </w:r>
+            <w:proofErr w:type="spellStart"/>
+            <w:r>
+              <w:t>phaeopus</w:t>
+            </w:r>
+            <w:proofErr w:type="spellEnd"/>
+          </w:p>
+        </w:tc>
+        <w:tc>
+          <w:tcPr>
+            <w:tcW w:w="987" w:type="dxa"/>
+            <w:noWrap/>
+            <w:hideMark/>
+          </w:tcPr>
+          <w:p>
+            <w:r>
+              <w:t>NA</w:t>
+            </w:r>
+          </w:p>
+        </w:tc>
+        <w:tc>
+          <w:tcPr>
+            <w:tcW w:w="965" w:type="dxa"/>
+            <w:noWrap/>
+            <w:hideMark/>
+          </w:tcPr>
+          <w:p>
+            <w:r>
+              <w:t>no</w:t>
+            </w:r>
+          </w:p>
+        </w:tc>
+      </w:tr>
+      <w:tr>
+        <w:trPr>
+          <w:trHeight w:val="288"/>
+        </w:trPr>
+        <w:tc>
+          <w:tcPr>
+            <w:tcW w:w="4120" w:type="dxa"/>
+            <w:noWrap/>
+            <w:hideMark/>
+          </w:tcPr>
+          <w:p>
+            <w:r>
+              <w:t>Laysan Albatross</w:t>
+            </w:r>
+          </w:p>
+        </w:tc>
+        <w:tc>
+          <w:tcPr>
+            <w:tcW w:w="4160" w:type="dxa"/>
+            <w:noWrap/>
+            <w:hideMark/>
+          </w:tcPr>
+          <w:p>
+            <w:proofErr w:type="spellStart"/>
+            <w:r>
+              <w:t>Phoebastria</w:t>
+            </w:r>
+            <w:proofErr w:type="spellEnd"/>
+            <w:r>
+              <w:t xml:space="preserve"> </w:t>
+            </w:r>
+            <w:proofErr w:type="spellStart"/>
+            <w:r>
+              <w:t>immutabilis</w:t>
+            </w:r>
+            <w:proofErr w:type="spellEnd"/>
+          </w:p>
+        </w:tc>
+        <w:tc>
+          <w:tcPr>
+            <w:tcW w:w="987" w:type="dxa"/>
+            <w:noWrap/>
+            <w:hideMark/>
+          </w:tcPr>
+          <w:p>
+            <w:r>
+              <w:t>NA</w:t>
+            </w:r>
+          </w:p>
+        </w:tc>
+        <w:tc>
+          <w:tcPr>
+            <w:tcW w:w="965" w:type="dxa"/>
+            <w:noWrap/>
+            <w:hideMark/>
+          </w:tcPr>
+          <w:p>
+            <w:r>
+              <w:t>no</w:t>
+            </w:r>
+          </w:p>
+        </w:tc>
+      </w:tr>
+      <w:tr>
+        <w:trPr>
+          <w:trHeight w:val="288"/>
+        </w:trPr>
+        <w:tc>
+          <w:tcPr>
+            <w:tcW w:w="4120" w:type="dxa"/>
+            <w:noWrap/>
+            <w:hideMark/>
+          </w:tcPr>
+          <w:p>
+            <w:r>
+              <w:t>Leach's Storm-Petrel</w:t>
+            </w:r>
+          </w:p>
+        </w:tc>
+        <w:tc>
+          <w:tcPr>
+            <w:tcW w:w="4160" w:type="dxa"/>
+            <w:noWrap/>
+            <w:hideMark/>
+          </w:tcPr>
+          <w:p>
+            <w:proofErr w:type="spellStart"/>
+            <w:r>
+              <w:t>Hydrobates</w:t>
+            </w:r>
+            <w:proofErr w:type="spellEnd"/>
+            <w:r>
+              <w:t xml:space="preserve"> </w:t>
+            </w:r>
+            <w:proofErr w:type="spellStart"/>
+            <w:r>
+              <w:t>leucorhous</w:t>
+            </w:r>
+            <w:proofErr w:type="spellEnd"/>
+          </w:p>
+        </w:tc>
+        <w:tc>
+          <w:tcPr>
+            <w:tcW w:w="987" w:type="dxa"/>
+            <w:noWrap/>
+            <w:hideMark/>
+          </w:tcPr>
+          <w:p>
+            <w:r>
+              <w:t>NA</w:t>
+            </w:r>
+          </w:p>
+        </w:tc>
+        <w:tc>
+          <w:tcPr>
+            <w:tcW w:w="965" w:type="dxa"/>
+            <w:noWrap/>
+            <w:hideMark/>
+          </w:tcPr>
+          <w:p>
+            <w:r>
+              <w:t>no</w:t>
+            </w:r>
+          </w:p>
+        </w:tc>
+      </w:tr>
+      <w:tr>
+        <w:trPr>
+          <w:trHeight w:val="288"/>
+        </w:trPr>
+        <w:tc>
+          <w:tcPr>
+            <w:tcW w:w="4120" w:type="dxa"/>
+            <w:noWrap/>
+            <w:hideMark/>
+          </w:tcPr>
+          <w:p>
+            <w:r>
+              <w:t>Little Stint</w:t>
+            </w:r>
+          </w:p>
+        </w:tc>
+        <w:tc>
+          <w:tcPr>
+            <w:tcW w:w="4160" w:type="dxa"/>
+            <w:noWrap/>
+            <w:hideMark/>
+          </w:tcPr>
+          <w:p>
+            <w:r>
+              <w:t xml:space="preserve">Calidris </w:t>
+            </w:r>
+            <w:proofErr w:type="spellStart"/>
+            <w:r>
+              <w:t>minuta</w:t>
+            </w:r>
+            <w:proofErr w:type="spellEnd"/>
+          </w:p>
+        </w:tc>
+        <w:tc>
+          <w:tcPr>
+            <w:tcW w:w="987" w:type="dxa"/>
+            <w:noWrap/>
+            <w:hideMark/>
+          </w:tcPr>
+          <w:p>
+            <w:r>
+              <w:t>NA</w:t>
+            </w:r>
+          </w:p>
+        </w:tc>
+        <w:tc>
+          <w:tcPr>
+            <w:tcW w:w="965" w:type="dxa"/>
+            <w:noWrap/>
+            <w:hideMark/>
+          </w:tcPr>
+          <w:p>
+            <w:r>
+              <w:t>no</w:t>
+            </w:r>
+          </w:p>
+        </w:tc>
+      </w:tr>
+      <w:tr>
+        <w:trPr>
+          <w:trHeight w:val="288"/>
+        </w:trPr>
+        <w:tc>
+          <w:tcPr>
+            <w:tcW w:w="4120" w:type="dxa"/>
+            <w:noWrap/>
+            <w:hideMark/>
+          </w:tcPr>
+          <w:p>
+            <w:r>
+              <w:t>Long-tailed Jaeger</w:t>
+            </w:r>
+          </w:p>
+        </w:tc>
+        <w:tc>
+          <w:tcPr>
+            <w:tcW w:w="4160" w:type="dxa"/>
+            <w:noWrap/>
+            <w:hideMark/>
+          </w:tcPr>
+          <w:p>
+            <w:proofErr w:type="spellStart"/>
+            <w:r>
+              <w:t>Stercorarius</w:t>
+            </w:r>
+            <w:proofErr w:type="spellEnd"/>
+            <w:r>
+              <w:t xml:space="preserve"> </w:t>
+            </w:r>
+            <w:proofErr w:type="spellStart"/>
+            <w:r>
+              <w:t>longicaudus</w:t>
+            </w:r>
+            <w:proofErr w:type="spellEnd"/>
+          </w:p>
+        </w:tc>
+        <w:tc>
+          <w:tcPr>
+            <w:tcW w:w="987" w:type="dxa"/>
+            <w:noWrap/>
+            <w:hideMark/>
+          </w:tcPr>
+          <w:p>
+            <w:r>
+              <w:t>NA</w:t>
+            </w:r>
+          </w:p>
+        </w:tc>
+        <w:tc>
+          <w:tcPr>
+            <w:tcW w:w="965" w:type="dxa"/>
+            <w:noWrap/>
+            <w:hideMark/>
+          </w:tcPr>
+          <w:p>
+            <w:r>
+              <w:t>no</w:t>
+            </w:r>
+          </w:p>
+        </w:tc>
+      </w:tr>
+      <w:tr>
+        <w:trPr>
+          <w:trHeight w:val="288"/>
+        </w:trPr>
+        <w:tc>
+          <w:tcPr>
+            <w:tcW w:w="4120" w:type="dxa"/>
+            <w:noWrap/>
+            <w:hideMark/>
+          </w:tcPr>
+          <w:p>
+            <w:r>
+              <w:t>Northern Wheatear</w:t>
+            </w:r>
+          </w:p>
+        </w:tc>
+        <w:tc>
+          <w:tcPr>
+            <w:tcW w:w="4160" w:type="dxa"/>
+            <w:noWrap/>
+            <w:hideMark/>
+          </w:tcPr>
+          <w:p>
+            <w:r>
+              <w:t xml:space="preserve">Oenanthe </w:t>
+            </w:r>
+            <w:proofErr w:type="spellStart"/>
+            <w:r>
+              <w:t>oenanthe</w:t>
+            </w:r>
+            <w:proofErr w:type="spellEnd"/>
+          </w:p>
+        </w:tc>
+        <w:tc>
+          <w:tcPr>
+            <w:tcW w:w="987" w:type="dxa"/>
+            <w:noWrap/>
+            <w:hideMark/>
+          </w:tcPr>
+          <w:p>
+            <w:r>
+              <w:t>NA</w:t>
+            </w:r>
+          </w:p>
+        </w:tc>
+        <w:tc>
+          <w:tcPr>
+            <w:tcW w:w="965" w:type="dxa"/>
+            <w:noWrap/>
+            <w:hideMark/>
+          </w:tcPr>
+          <w:p>
+            <w:r>
+              <w:t>no</w:t>
+            </w:r>
+          </w:p>
+        </w:tc>
+      </w:tr>
+      <w:tr>
+        <w:trPr>
+          <w:trHeight w:val="288"/>
+        </w:trPr>
+        <w:tc>
+          <w:tcPr>
+            <w:tcW w:w="4120" w:type="dxa"/>
+            <w:noWrap/>
+            <w:hideMark/>
+          </w:tcPr>
+          <w:p>
+            <w:r>
+              <w:t>Pacific Golden-Plover</w:t>
+            </w:r>
+          </w:p>
+        </w:tc>
+        <w:tc>
+          <w:tcPr>
+            <w:tcW w:w="4160" w:type="dxa"/>
+            <w:noWrap/>
+            <w:hideMark/>
+          </w:tcPr>
+          <w:p>
+            <w:proofErr w:type="spellStart"/>
+            <w:r>
+              <w:t>Pluvialis</w:t>
+            </w:r>
+            <w:proofErr w:type="spellEnd"/>
+            <w:r>
+              <w:t xml:space="preserve"> fulva</w:t>
+            </w:r>
+          </w:p>
+        </w:tc>
+        <w:tc>
+          <w:tcPr>
+            <w:tcW w:w="987" w:type="dxa"/>
+            <w:noWrap/>
+            <w:hideMark/>
+          </w:tcPr>
+          <w:p>
+            <w:r>
+              <w:t>NA</w:t>
+            </w:r>
+          </w:p>
+        </w:tc>
+        <w:tc>
+          <w:tcPr>
+            <w:tcW w:w="965" w:type="dxa"/>
+            <w:noWrap/>
+            <w:hideMark/>
+          </w:tcPr>
+          <w:p>
+            <w:r>
+              <w:t>no</w:t>
+            </w:r>
+          </w:p>
+        </w:tc>
+      </w:tr>
+      <w:tr>
+        <w:trPr>
+          <w:trHeight w:val="288"/>
+        </w:trPr>
+        <w:tc>
+          <w:tcPr>
+            <w:tcW w:w="4120" w:type="dxa"/>
+            <w:noWrap/>
+            <w:hideMark/>
+          </w:tcPr>
+          <w:p>
+            <w:r>
+              <w:t>Parakeet Auklet</w:t>
+            </w:r>
+          </w:p>
+        </w:tc>
+        <w:tc>
+          <w:tcPr>
+            <w:tcW w:w="4160" w:type="dxa"/>
+            <w:noWrap/>
+            <w:hideMark/>
+          </w:tcPr>
+          <w:p>
+            <w:r>
+              <w:t xml:space="preserve">Aethia </w:t>
+            </w:r>
+            <w:proofErr w:type="spellStart"/>
+            <w:r>
+              <w:t>psittacula</w:t>
+            </w:r>
+            <w:proofErr w:type="spellEnd"/>
+          </w:p>
+        </w:tc>
+        <w:tc>
+          <w:tcPr>
+            <w:tcW w:w="987" w:type="dxa"/>
+            <w:noWrap/>
+            <w:hideMark/>
+          </w:tcPr>
+          <w:p>
+            <w:r>
+              <w:t>NA</w:t>
+            </w:r>
+          </w:p>
+        </w:tc>
+        <w:tc>
+          <w:tcPr>
+            <w:tcW w:w="965" w:type="dxa"/>
+            <w:noWrap/>
+            <w:hideMark/>
+          </w:tcPr>
+          <w:p>
+            <w:r>
+              <w:t>no</w:t>
+            </w:r>
+          </w:p>
+        </w:tc>
+      </w:tr>
+      <w:tr>
+        <w:trPr>
+          <w:trHeight w:val="288"/>
+        </w:trPr>
+        <w:tc>
+          <w:tcPr>
+            <w:tcW w:w="4120" w:type="dxa"/>
+            <w:noWrap/>
+            <w:hideMark/>
+          </w:tcPr>
+          <w:p>
+            <w:r>
+              <w:t>Pink-footed Shearwater</w:t>
+            </w:r>
+          </w:p>
+        </w:tc>
+        <w:tc>
+          <w:tcPr>
+            <w:tcW w:w="4160" w:type="dxa"/>
+            <w:noWrap/>
+            <w:hideMark/>
+          </w:tcPr>
+          <w:p>
+            <w:proofErr w:type="spellStart"/>
+            <w:r>
+              <w:t>Ardenna</w:t>
+            </w:r>
+            <w:proofErr w:type="spellEnd"/>
+            <w:r>
+              <w:t xml:space="preserve"> </w:t>
+            </w:r>
+            <w:proofErr w:type="spellStart"/>
+            <w:r>
+              <w:t>creatopus</w:t>
+            </w:r>
+            <w:proofErr w:type="spellEnd"/>
+          </w:p>
+        </w:tc>
+        <w:tc>
+          <w:tcPr>
+            <w:tcW w:w="987" w:type="dxa"/>
+            <w:noWrap/>
+            <w:hideMark/>
+          </w:tcPr>
+          <w:p>
+            <w:r>
+              <w:t>NA</w:t>
+            </w:r>
+          </w:p>
+        </w:tc>
+        <w:tc>
+          <w:tcPr>
+            <w:tcW w:w="965" w:type="dxa"/>
+            <w:noWrap/>
+            <w:hideMark/>
+          </w:tcPr>
+          <w:p>
+            <w:r>
+              <w:t>no</w:t>
+            </w:r>
+          </w:p>
+        </w:tc>
+      </w:tr>
+      <w:tr>
+        <w:trPr>
+          <w:trHeight w:val="288"/>
+        </w:trPr>
+        <w:tc>
+          <w:tcPr>
+            <w:tcW w:w="4120" w:type="dxa"/>
+            <w:noWrap/>
+            <w:hideMark/>
+          </w:tcPr>
+          <w:p>
+            <w:r>
+              <w:t>Red Phalarope</w:t>
+            </w:r>
+          </w:p>
+        </w:tc>
+        <w:tc>
+          <w:tcPr>
+            <w:tcW w:w="4160" w:type="dxa"/>
+            <w:noWrap/>
+            <w:hideMark/>
+          </w:tcPr>
+          <w:p>
+            <w:proofErr w:type="spellStart"/>
+            <w:r>
+              <w:t>Phalaropus</w:t>
+            </w:r>
+            <w:proofErr w:type="spellEnd"/>
+            <w:r>
+              <w:t xml:space="preserve"> </w:t>
+            </w:r>
+            <w:proofErr w:type="spellStart"/>
+            <w:r>
+              <w:t>fulicarius</w:t>
+            </w:r>
+            <w:proofErr w:type="spellEnd"/>
+          </w:p>
+        </w:tc>
+        <w:tc>
+          <w:tcPr>
+            <w:tcW w:w="987" w:type="dxa"/>
+            <w:noWrap/>
+            <w:hideMark/>
+          </w:tcPr>
+          <w:p>
+            <w:r>
+              <w:t>NA</w:t>
+            </w:r>
+          </w:p>
+        </w:tc>
+        <w:tc>
+          <w:tcPr>
+            <w:tcW w:w="965" w:type="dxa"/>
+            <w:noWrap/>
+            <w:hideMark/>
+          </w:tcPr>
+          <w:p>
+            <w:r>
+              <w:t>no</w:t>
+            </w:r>
+          </w:p>
+        </w:tc>
+      </w:tr>
+      <w:tr>
+        <w:trPr>
+          <w:trHeight w:val="288"/>
+        </w:trPr>
+        <w:tc>
+          <w:tcPr>
+            <w:tcW w:w="4120" w:type="dxa"/>
+            <w:noWrap/>
+            <w:hideMark/>
+          </w:tcPr>
+          <w:p>
+            <w:r>
+              <w:t>Red-necked Phalarope</w:t>
+            </w:r>
+          </w:p>
+        </w:tc>
+        <w:tc>
+          <w:tcPr>
+            <w:tcW w:w="4160" w:type="dxa"/>
+            <w:noWrap/>
+            <w:hideMark/>
+          </w:tcPr>
+          <w:p>
+            <w:proofErr w:type="spellStart"/>
+            <w:r>
+              <w:t>Phalaropus</w:t>
+            </w:r>
+            <w:proofErr w:type="spellEnd"/>
+            <w:r>
+              <w:t xml:space="preserve"> </w:t>
+            </w:r>
+            <w:proofErr w:type="spellStart"/>
+            <w:r>
+              <w:t>lobatus</w:t>
+            </w:r>
+            <w:proofErr w:type="spellEnd"/>
+          </w:p>
+        </w:tc>
+        <w:tc>
+          <w:tcPr>
+            <w:tcW w:w="987" w:type="dxa"/>
+            <w:noWrap/>
+            <w:hideMark/>
+          </w:tcPr>
+          <w:p>
+            <w:r>
+              <w:t>NA</w:t>
+            </w:r>
+          </w:p>
+        </w:tc>
+        <w:tc>
+          <w:tcPr>
+            <w:tcW w:w="965" w:type="dxa"/>
+            <w:noWrap/>
+            <w:hideMark/>
+          </w:tcPr>
+          <w:p>
+            <w:r>
+              <w:t>no</w:t>
+            </w:r>
+          </w:p>
+        </w:tc>
+      </w:tr>
+      <w:tr>
+        <w:trPr>
+          <w:trHeight w:val="288"/>
+        </w:trPr>
+        <w:tc>
+          <w:tcPr>
+            <w:tcW w:w="4120" w:type="dxa"/>
+            <w:noWrap/>
+            <w:hideMark/>
+          </w:tcPr>
+          <w:p>
+            <w:r>
+              <w:t>Red-necked Stint</w:t>
+            </w:r>
+          </w:p>
+        </w:tc>
+        <w:tc>
+          <w:tcPr>
+            <w:tcW w:w="4160" w:type="dxa"/>
+            <w:noWrap/>
+            <w:hideMark/>
+          </w:tcPr>
+          <w:p>
+            <w:r>
+              <w:t>Calidris ruficollis</w:t>
+            </w:r>
+          </w:p>
+        </w:tc>
+        <w:tc>
+          <w:tcPr>
+            <w:tcW w:w="987" w:type="dxa"/>
+            <w:noWrap/>
+            <w:hideMark/>
+          </w:tcPr>
+          <w:p>
+            <w:r>
+              <w:t>NA</w:t>
+            </w:r>
+          </w:p>
+        </w:tc>
+        <w:tc>
+          <w:tcPr>
+            <w:tcW w:w="965" w:type="dxa"/>
+            <w:noWrap/>
+            <w:hideMark/>
+          </w:tcPr>
+          <w:p>
+            <w:r>
+              <w:t>no</w:t>
+            </w:r>
+          </w:p>
+        </w:tc>
+      </w:tr>
+      <w:tr>
+        <w:trPr>
+          <w:trHeight w:val="288"/>
+        </w:trPr>
+        <w:tc>
+          <w:tcPr>
+            <w:tcW w:w="4120" w:type="dxa"/>
+            <w:noWrap/>
+            <w:hideMark/>
+          </w:tcPr>
+          <w:p>
+            <w:r>
+              <w:t>Redpoll</w:t>
+            </w:r>
+          </w:p>
+        </w:tc>
+        <w:tc>
+          <w:tcPr>
+            <w:tcW w:w="4160" w:type="dxa"/>
+            <w:noWrap/>
+            <w:hideMark/>
+          </w:tcPr>
+          <w:p>
+            <w:r>
+              <w:t>Acanthis flammea</w:t>
+            </w:r>
+          </w:p>
+        </w:tc>
+        <w:tc>
+          <w:tcPr>
+            <w:tcW w:w="987" w:type="dxa"/>
+            <w:noWrap/>
+            <w:hideMark/>
+          </w:tcPr>
+          <w:p>
+            <w:r>
+              <w:t>NA</w:t>
+            </w:r>
+          </w:p>
+        </w:tc>
+        <w:tc>
+          <w:tcPr>
+            <w:tcW w:w="965" w:type="dxa"/>
+            <w:noWrap/>
+            <w:hideMark/>
+          </w:tcPr>
+          <w:p>
+            <w:r>
+              <w:t>no</w:t>
+            </w:r>
+          </w:p>
+        </w:tc>
+      </w:tr>
+      <w:tr>
+        <w:trPr>
+          <w:trHeight w:val="288"/>
+        </w:trPr>
+        <w:tc>
+          <w:tcPr>
+            <w:tcW w:w="4120" w:type="dxa"/>
+            <w:noWrap/>
+            <w:hideMark/>
+          </w:tcPr>
+          <w:p>
+            <w:r>
+              <w:t>Rhinoceros Auklet</w:t>
+            </w:r>
+          </w:p>
+        </w:tc>
+        <w:tc>
+          <w:tcPr>
+            <w:tcW w:w="4160" w:type="dxa"/>
+            <w:noWrap/>
+            <w:hideMark/>
+          </w:tcPr>
+          <w:p>
+            <w:proofErr w:type="spellStart"/>
+            <w:r>
+              <w:t>Cerorhinca</w:t>
+            </w:r>
+            <w:proofErr w:type="spellEnd"/>
+            <w:r>
+              <w:t xml:space="preserve"> </w:t>
+            </w:r>
+            <w:proofErr w:type="spellStart"/>
+            <w:r>
+              <w:t>monocerata</w:t>
+            </w:r>
+            <w:proofErr w:type="spellEnd"/>
+          </w:p>
+        </w:tc>
+        <w:tc>
+          <w:tcPr>
+            <w:tcW w:w="987" w:type="dxa"/>
+            <w:noWrap/>
+            <w:hideMark/>
+          </w:tcPr>
+          <w:p>
+            <w:r>
+              <w:t>NA</w:t>
+            </w:r>
+          </w:p>
+        </w:tc>
+        <w:tc>
+          <w:tcPr>
+            <w:tcW w:w="965" w:type="dxa"/>
+            <w:noWrap/>
+            <w:hideMark/>
+          </w:tcPr>
+          <w:p>
+            <w:r>
+              <w:t>no</w:t>
+            </w:r>
+          </w:p>
+        </w:tc>
+      </w:tr>
+      <w:tr>
+        <w:trPr>
+          <w:trHeight w:val="288"/>
+        </w:trPr>
+        <w:tc>
+          <w:tcPr>
+            <w:tcW w:w="4120" w:type="dxa"/>
+            <w:noWrap/>
+            <w:hideMark/>
+          </w:tcPr>
+          <w:p>
+            <w:r>
+              <w:t>Rock Ptarmigan</w:t>
+            </w:r>
+          </w:p>
+        </w:tc>
+        <w:tc>
+          <w:tcPr>
+            <w:tcW w:w="4160" w:type="dxa"/>
+            <w:noWrap/>
+            <w:hideMark/>
+          </w:tcPr>
+          <w:p>
+            <w:r>
+              <w:t>Lagopus muta</w:t>
+            </w:r>
+          </w:p>
+        </w:tc>
+        <w:tc>
+          <w:tcPr>
+            <w:tcW w:w="987" w:type="dxa"/>
+            <w:noWrap/>
+            <w:hideMark/>
+          </w:tcPr>
+          <w:p>
+            <w:r>
+              <w:t>NA</w:t>
+            </w:r>
+          </w:p>
+        </w:tc>
+        <w:tc>
+          <w:tcPr>
+            <w:tcW w:w="965" w:type="dxa"/>
+            <w:noWrap/>
+            <w:hideMark/>
+          </w:tcPr>
+          <w:p>
+            <w:r>
+              <w:t>no</w:t>
+            </w:r>
+          </w:p>
+        </w:tc>
+      </w:tr>
+      <w:tr>
+        <w:trPr>
+          <w:trHeight w:val="288"/>
+        </w:trPr>
+        <w:tc>
+          <w:tcPr>
+            <w:tcW w:w="4120" w:type="dxa"/>
+            <w:noWrap/>
+            <w:hideMark/>
+          </w:tcPr>
+          <w:p>
+            <w:r>
+              <w:t>Ruff</w:t>
+            </w:r>
+          </w:p>
+        </w:tc>
+        <w:tc>
+          <w:tcPr>
+            <w:tcW w:w="4160" w:type="dxa"/>
+            <w:noWrap/>
+            <w:hideMark/>
+          </w:tcPr>
+          <w:p>
+            <w:r>
+              <w:t>Calidris pugnax</w:t>
+            </w:r>
+          </w:p>
+        </w:tc>
+        <w:tc>
+          <w:tcPr>
+            <w:tcW w:w="987" w:type="dxa"/>
+            <w:noWrap/>
+            <w:hideMark/>
+          </w:tcPr>
+          <w:p>
+            <w:r>
+              <w:t>NA</w:t>
+            </w:r>
+          </w:p>
+        </w:tc>
+        <w:tc>
+          <w:tcPr>
+            <w:tcW w:w="965" w:type="dxa"/>
+            <w:noWrap/>
+            <w:hideMark/>
+          </w:tcPr>
+          <w:p>
+            <w:r>
+              <w:t>no</w:t>
+            </w:r>
+          </w:p>
+        </w:tc>
+      </w:tr>
+      <w:tr>
+        <w:trPr>
+          <w:trHeight w:val="288"/>
+        </w:trPr>
+        <w:tc>
+          <w:tcPr>
+            <w:tcW w:w="4120" w:type="dxa"/>
+            <w:noWrap/>
+            <w:hideMark/>
+          </w:tcPr>
+          <w:p>
+            <w:r>
+              <w:t>Sharp-tailed Sandpiper</w:t>
+            </w:r>
+          </w:p>
+        </w:tc>
+        <w:tc>
+          <w:tcPr>
+            <w:tcW w:w="4160" w:type="dxa"/>
+            <w:noWrap/>
+            <w:hideMark/>
+          </w:tcPr>
+          <w:p>
+            <w:r>
+              <w:t>Calidris acuminata</w:t>
+            </w:r>
+          </w:p>
+        </w:tc>
+        <w:tc>
+          <w:tcPr>
+            <w:tcW w:w="987" w:type="dxa"/>
+            <w:noWrap/>
+            <w:hideMark/>
+          </w:tcPr>
+          <w:p>
+            <w:r>
+              <w:t>NA</w:t>
+            </w:r>
+          </w:p>
+        </w:tc>
+        <w:tc>
+          <w:tcPr>
+            <w:tcW w:w="965" w:type="dxa"/>
+            <w:noWrap/>
+            <w:hideMark/>
+          </w:tcPr>
+          <w:p>
+            <w:r>
+              <w:t>no</w:t>
+            </w:r>
+          </w:p>
+        </w:tc>
+      </w:tr>
+      <w:tr>
+        <w:trPr>
+          <w:trHeight w:val="288"/>
+        </w:trPr>
+        <w:tc>
+          <w:tcPr>
+            <w:tcW w:w="4120" w:type="dxa"/>
+            <w:noWrap/>
+            <w:hideMark/>
+          </w:tcPr>
+          <w:p>
+            <w:r>
+              <w:t>Short-tailed Albatross</w:t>
+            </w:r>
+          </w:p>
+        </w:tc>
+        <w:tc>
+          <w:tcPr>
+            <w:tcW w:w="4160" w:type="dxa"/>
+            <w:noWrap/>
+            <w:hideMark/>
+          </w:tcPr>
+          <w:p>
+            <w:proofErr w:type="spellStart"/>
+            <w:r>
+              <w:t>Phoebastria</w:t>
+            </w:r>
+            <w:proofErr w:type="spellEnd"/>
+            <w:r>
+              <w:t xml:space="preserve"> </w:t>
+            </w:r>
+            <w:proofErr w:type="spellStart"/>
+            <w:r>
+              <w:t>albatrus</w:t>
+            </w:r>
+            <w:proofErr w:type="spellEnd"/>
+          </w:p>
+        </w:tc>
+        <w:tc>
+          <w:tcPr>
+            <w:tcW w:w="987" w:type="dxa"/>
+            <w:noWrap/>
+            <w:hideMark/>
+          </w:tcPr>
+          <w:p>
+            <w:r>
+              <w:t>NA</w:t>
+            </w:r>
+          </w:p>
+        </w:tc>
+        <w:tc>
+          <w:tcPr>
+            <w:tcW w:w="965" w:type="dxa"/>
+            <w:noWrap/>
+            <w:hideMark/>
+          </w:tcPr>
+          <w:p>
+            <w:r>
+              <w:t>no</w:t>
+            </w:r>
+          </w:p>
+        </w:tc>
+      </w:tr>
+      <w:tr>
+        <w:trPr>
+          <w:trHeight w:val="288"/>
+        </w:trPr>
+        <w:tc>
+          <w:tcPr>
+            <w:tcW w:w="4120" w:type="dxa"/>
+            <w:noWrap/>
+            <w:hideMark/>
+          </w:tcPr>
+          <w:p>
+            <w:r>
+              <w:t>Short-tailed Shearwater</w:t>
+            </w:r>
+          </w:p>
+        </w:tc>
+        <w:tc>
+          <w:tcPr>
+            <w:tcW w:w="4160" w:type="dxa"/>
+            <w:noWrap/>
+            <w:hideMark/>
+          </w:tcPr>
+          <w:p>
+            <w:proofErr w:type="spellStart"/>
+            <w:r>
+              <w:t>Ardenna</w:t>
+            </w:r>
+            <w:proofErr w:type="spellEnd"/>
+            <w:r>
+              <w:t xml:space="preserve"> tenuirostris</w:t>
+            </w:r>
+          </w:p>
+        </w:tc>
+        <w:tc>
+          <w:tcPr>
+            <w:tcW w:w="987" w:type="dxa"/>
+            <w:noWrap/>
+            <w:hideMark/>
+          </w:tcPr>
+          <w:p>
+            <w:r>
+              <w:t>NA</w:t>
+            </w:r>
+          </w:p>
+        </w:tc>
+        <w:tc>
+          <w:tcPr>
+            <w:tcW w:w="965" w:type="dxa"/>
+            <w:noWrap/>
+            <w:hideMark/>
+          </w:tcPr>
+          <w:p>
+            <w:r>
+              <w:t>no</w:t>
+            </w:r>
+          </w:p>
+        </w:tc>
+      </w:tr>
+      <w:tr>
+        <w:trPr>
+          <w:trHeight w:val="288"/>
+        </w:trPr>
+        <w:tc>
+          <w:tcPr>
+            <w:tcW w:w="4120" w:type="dxa"/>
+            <w:noWrap/>
+            <w:hideMark/>
+          </w:tcPr>
+          <w:p>
+            <w:r>
+              <w:t>Smith's Longspur</w:t>
+            </w:r>
+          </w:p>
+        </w:tc>
+        <w:tc>
+          <w:tcPr>
+            <w:tcW w:w="4160" w:type="dxa"/>
+            <w:noWrap/>
+            <w:hideMark/>
+          </w:tcPr>
+          <w:p>
+            <w:proofErr w:type="spellStart"/>
+            <w:r>
+              <w:t>Calcarius</w:t>
+            </w:r>
+            <w:proofErr w:type="spellEnd"/>
+            <w:r>
+              <w:t xml:space="preserve"> pictus</w:t>
+            </w:r>
+          </w:p>
+        </w:tc>
+        <w:tc>
+          <w:tcPr>
+            <w:tcW w:w="987" w:type="dxa"/>
+            <w:noWrap/>
+            <w:hideMark/>
+          </w:tcPr>
+          <w:p>
+            <w:r>
+              <w:t>NA</w:t>
+            </w:r>
+          </w:p>
+        </w:tc>
+        <w:tc>
+          <w:tcPr>
+            <w:tcW w:w="965" w:type="dxa"/>
+            <w:noWrap/>
+            <w:hideMark/>
+          </w:tcPr>
+          <w:p>
+            <w:r>
+              <w:t>no</w:t>
+            </w:r>
+          </w:p>
+        </w:tc>
+      </w:tr>
+      <w:tr>
+        <w:trPr>
+          <w:trHeight w:val="288"/>
+        </w:trPr>
+        <w:tc>
+          <w:tcPr>
+            <w:tcW w:w="4120" w:type="dxa"/>
+            <w:noWrap/>
+            <w:hideMark/>
+          </w:tcPr>
+          <w:p>
+            <w:r>
+              <w:t>Sooty Shearwater</w:t>
+            </w:r>
+          </w:p>
+        </w:tc>
+        <w:tc>
+          <w:tcPr>
+            <w:tcW w:w="4160" w:type="dxa"/>
+            <w:noWrap/>
+            <w:hideMark/>
+          </w:tcPr>
+          <w:p>
+            <w:proofErr w:type="spellStart"/>
+            <w:r>
+              <w:t>Ardenna</w:t>
+            </w:r>
+            <w:proofErr w:type="spellEnd"/>
+            <w:r>
+              <w:t xml:space="preserve"> grisea</w:t>
+            </w:r>
+          </w:p>
+        </w:tc>
+        <w:tc>
+          <w:tcPr>
+            <w:tcW w:w="987" w:type="dxa"/>
+            <w:noWrap/>
+            <w:hideMark/>
+          </w:tcPr>
+          <w:p>
+            <w:r>
+              <w:t>NA</w:t>
+            </w:r>
+          </w:p>
+        </w:tc>
+        <w:tc>
+          <w:tcPr>
+            <w:tcW w:w="965" w:type="dxa"/>
+            <w:noWrap/>
+            <w:hideMark/>
+          </w:tcPr>
+          <w:p>
+            <w:r>
+              <w:t>no</w:t>
+            </w:r>
+          </w:p>
+        </w:tc>
+      </w:tr>
+      <w:tr>
+        <w:trPr>
+          <w:trHeight w:val="288"/>
+        </w:trPr>
+        <w:tc>
+          <w:tcPr>
+            <w:tcW w:w="4120" w:type="dxa"/>
+            <w:noWrap/>
+            <w:hideMark/>
+          </w:tcPr>
+          <w:p>
+            <w:r>
+              <w:t>South Polar Skua</w:t>
+            </w:r>
+          </w:p>
+        </w:tc>
+        <w:tc>
+          <w:tcPr>
+            <w:tcW w:w="4160" w:type="dxa"/>
+            <w:noWrap/>
+            <w:hideMark/>
+          </w:tcPr>
+          <w:p>
+            <w:proofErr w:type="spellStart"/>
+            <w:r>
+              <w:t>Stercorarius</w:t>
+            </w:r>
+            <w:proofErr w:type="spellEnd"/>
+            <w:r>
+              <w:t xml:space="preserve"> </w:t>
+            </w:r>
+            <w:proofErr w:type="spellStart"/>
+            <w:r>
+              <w:t>maccormicki</w:t>
+            </w:r>
+            <w:proofErr w:type="spellEnd"/>
+          </w:p>
+        </w:tc>
+        <w:tc>
+          <w:tcPr>
+            <w:tcW w:w="987" w:type="dxa"/>
+            <w:noWrap/>
+            <w:hideMark/>
+          </w:tcPr>
+          <w:p>
+            <w:r>
+              <w:t>NA</w:t>
+            </w:r>
+          </w:p>
+        </w:tc>
+        <w:tc>
+          <w:tcPr>
+            <w:tcW w:w="965" w:type="dxa"/>
+            <w:noWrap/>
+            <w:hideMark/>
+          </w:tcPr>
+          <w:p>
+            <w:r>
+              <w:t>no</w:t>
+            </w:r>
+          </w:p>
+        </w:tc>
+      </w:tr>
+      <w:tr>
+        <w:trPr>
+          <w:trHeight w:val="288"/>
+        </w:trPr>
+        <w:tc>
+          <w:tcPr>
+            <w:tcW w:w="4120" w:type="dxa"/>
+            <w:noWrap/>
+            <w:hideMark/>
+          </w:tcPr>
+          <w:p>
+            <w:r>
+              <w:t>Thick-billed Murre</w:t>
+            </w:r>
+          </w:p>
+        </w:tc>
+        <w:tc>
+          <w:tcPr>
+            <w:tcW w:w="4160" w:type="dxa"/>
+            <w:noWrap/>
+            <w:hideMark/>
+          </w:tcPr>
+          <w:p>
+            <w:r>
+              <w:t xml:space="preserve">Uria </w:t>
+            </w:r>
+            <w:proofErr w:type="spellStart"/>
+            <w:r>
+              <w:t>lomvia</w:t>
+            </w:r>
+            <w:proofErr w:type="spellEnd"/>
+          </w:p>
+        </w:tc>
+        <w:tc>
+          <w:tcPr>
+            <w:tcW w:w="987" w:type="dxa"/>
+            <w:noWrap/>
+            <w:hideMark/>
+          </w:tcPr>
+          <w:p>
+            <w:r>
+              <w:t>NA</w:t>
+            </w:r>
+          </w:p>
+        </w:tc>
+        <w:tc>
+          <w:tcPr>
+            <w:tcW w:w="965" w:type="dxa"/>
+            <w:noWrap/>
+            <w:hideMark/>
+          </w:tcPr>
+          <w:p>
+            <w:r>
+              <w:t>no</w:t>
+            </w:r>
+          </w:p>
+        </w:tc>
+      </w:tr>
+      <w:tr>
+        <w:trPr>
+          <w:trHeight w:val="288"/>
+        </w:trPr>
+        <w:tc>
+          <w:tcPr>
+            <w:tcW w:w="4120" w:type="dxa"/>
+            <w:noWrap/>
+            <w:hideMark/>
+          </w:tcPr>
+          <w:p>
+            <w:r>
+              <w:t>Tufted Puffin</w:t>
+            </w:r>
+          </w:p>
+        </w:tc>
+        <w:tc>
+          <w:tcPr>
+            <w:tcW w:w="4160" w:type="dxa"/>
+            <w:noWrap/>
+            <w:hideMark/>
+          </w:tcPr>
+          <w:p>
+            <w:proofErr w:type="spellStart"/>
+            <w:r>
+              <w:t>Fratercula</w:t>
+            </w:r>
+            <w:proofErr w:type="spellEnd"/>
+            <w:r>
+              <w:t xml:space="preserve"> </w:t>
+            </w:r>
+            <w:proofErr w:type="spellStart"/>
+            <w:r>
+              <w:t>cirrhata</w:t>
+            </w:r>
+            <w:proofErr w:type="spellEnd"/>
+          </w:p>
+        </w:tc>
+        <w:tc>
+          <w:tcPr>
+            <w:tcW w:w="987" w:type="dxa"/>
+            <w:noWrap/>
+            <w:hideMark/>
+          </w:tcPr>
+          <w:p>
+            <w:r>
+              <w:t>NA</w:t>
+            </w:r>
+          </w:p>
+        </w:tc>
+        <w:tc>
+          <w:tcPr>
+            <w:tcW w:w="965" w:type="dxa"/>
+            <w:noWrap/>
+            <w:hideMark/>
+          </w:tcPr>
+          <w:p>
+            <w:r>
+              <w:t>no</w:t>
+            </w:r>
+          </w:p>
+        </w:tc>
+      </w:tr>
+      <w:tr>
+        <w:trPr>
+          <w:trHeight w:val="288"/>
+        </w:trPr>
+        <w:tc>
+          <w:tcPr>
+            <w:tcW w:w="4120" w:type="dxa"/>
+            <w:noWrap/>
+            <w:hideMark/>
+          </w:tcPr>
+          <w:p>
+            <w:r>
+              <w:t>Western Cattle-Egret</w:t>
+            </w:r>
+          </w:p>
+        </w:tc>
+        <w:tc>
+          <w:tcPr>
+            <w:tcW w:w="4160" w:type="dxa"/>
+            <w:noWrap/>
+            <w:hideMark/>
+          </w:tcPr>
+          <w:p>
+            <w:r>
+              <w:t>Ardea ibis</w:t>
+            </w:r>
+          </w:p>
+        </w:tc>
+        <w:tc>
+          <w:tcPr>
+            <w:tcW w:w="987" w:type="dxa"/>
+            <w:noWrap/>
+            <w:hideMark/>
+          </w:tcPr>
+          <w:p>
+            <w:r>
+              <w:t>NA</w:t>
+            </w:r>
+          </w:p>
+        </w:tc>
+        <w:tc>
+          <w:tcPr>
+            <w:tcW w:w="965" w:type="dxa"/>
+            <w:noWrap/>
+            <w:hideMark/>
+          </w:tcPr>
+          <w:p>
+            <w:r>
+              <w:t>no</w:t>
+            </w:r>
+          </w:p>
+        </w:tc>
+      </w:tr>
+      <w:tr>
+        <w:trPr>
+          <w:trHeight w:val="288"/>
+        </w:trPr>
+        <w:tc>
+          <w:tcPr>
+            <w:tcW w:w="4120" w:type="dxa"/>
+            <w:noWrap/>
+            <w:hideMark/>
+          </w:tcPr>
+          <w:p>
+            <w:r>
+              <w:t>White-rumped Sandpiper</w:t>
+            </w:r>
+          </w:p>
+        </w:tc>
+        <w:tc>
+          <w:tcPr>
+            <w:tcW w:w="4160" w:type="dxa"/>
+            <w:noWrap/>
+            <w:hideMark/>
+          </w:tcPr>
+          <w:p>
+            <w:r>
+              <w:t xml:space="preserve">Calidris </w:t>
+            </w:r>
+            <w:proofErr w:type="spellStart"/>
+            <w:r>
+              <w:t>fuscicollis</w:t>
+            </w:r>
+            <w:proofErr w:type="spellEnd"/>
+          </w:p>
+        </w:tc>
+        <w:tc>
+          <w:tcPr>
+            <w:tcW w:w="987" w:type="dxa"/>
+            <w:noWrap/>
+            <w:hideMark/>
+          </w:tcPr>
+          <w:p>
+            <w:r>
+              <w:t>NA</w:t>
+            </w:r>
+          </w:p>
+        </w:tc>
+        <w:tc>
+          <w:tcPr>
+            <w:tcW w:w="965" w:type="dxa"/>
+            <w:noWrap/>
+            <w:hideMark/>
+          </w:tcPr>
+          <w:p>
+            <w:r>
+              <w:t>no</w:t>
+            </w:r>
+          </w:p>
+        </w:tc>
+      </w:tr>
+      <w:tr>
+        <w:trPr>
+          <w:trHeight w:val="288"/>
+        </w:trPr>
+        <w:tc>
+          <w:tcPr>
+            <w:tcW w:w="4120" w:type="dxa"/>
+            <w:noWrap/>
+            <w:hideMark/>
+          </w:tcPr>
+          <w:p>
+            <w:r>
+              <w:t>White-tailed Ptarmigan</w:t>
+            </w:r>
+          </w:p>
+        </w:tc>
+        <w:tc>
+          <w:tcPr>
+            <w:tcW w:w="4160" w:type="dxa"/>
+            <w:noWrap/>
+            <w:hideMark/>
+          </w:tcPr>
+          <w:p>
+            <w:r>
+              <w:t xml:space="preserve">Lagopus </w:t>
+            </w:r>
+            <w:proofErr w:type="spellStart"/>
+            <w:r>
+              <w:t>leucura</w:t>
+            </w:r>
+            <w:proofErr w:type="spellEnd"/>
+          </w:p>
+        </w:tc>
+        <w:tc>
+          <w:tcPr>
+            <w:tcW w:w="987" w:type="dxa"/>
+            <w:noWrap/>
+            <w:hideMark/>
+          </w:tcPr>
+          <w:p>
+            <w:r>
+              <w:t>NA</w:t>
+            </w:r>
+          </w:p>
+        </w:tc>
+        <w:tc>
+          <w:tcPr>
+            <w:tcW w:w="965" w:type="dxa"/>
+            <w:noWrap/>
+            <w:hideMark/>
+          </w:tcPr>
+          <w:p>
+            <w:r>
+              <w:t>no</w:t>
+            </w:r>
+          </w:p>
+        </w:tc>
+      </w:tr>
+      <w:tr>
+        <w:trPr>
+          <w:trHeight w:val="288"/>
+        </w:trPr>
+        <w:tc>
+          <w:tcPr>
+            <w:tcW w:w="4120" w:type="dxa"/>
+            <w:noWrap/>
+            <w:hideMark/>
+          </w:tcPr>
+          <w:p>
+            <w:r>
+              <w:t>Yellow Rail</w:t>
+            </w:r>
+          </w:p>
+        </w:tc>
+        <w:tc>
+          <w:tcPr>
+            <w:tcW w:w="4160" w:type="dxa"/>
+            <w:noWrap/>
+            <w:hideMark/>
+          </w:tcPr>
+          <w:p>
+            <w:proofErr w:type="spellStart"/>
+            <w:r>
+              <w:t>Coturnicops</w:t>
+            </w:r>
+            <w:proofErr w:type="spellEnd"/>
+            <w:r>
+              <w:t xml:space="preserve"> </w:t>
+            </w:r>
+            <w:proofErr w:type="spellStart"/>
+            <w:r>
+              <w:t>noveboracensis</w:t>
+            </w:r>
+            <w:proofErr w:type="spellEnd"/>
+          </w:p>
+        </w:tc>
+        <w:tc>
+          <w:tcPr>
+            <w:tcW w:w="987" w:type="dxa"/>
+            <w:noWrap/>
+            <w:hideMark/>
+          </w:tcPr>
+          <w:p>
+            <w:r>
+              <w:t>NA</w:t>
+            </w:r>
+          </w:p>
+        </w:tc>
+        <w:tc>
+          <w:tcPr>
+            <w:tcW w:w="965" w:type="dxa"/>
+            <w:noWrap/>
+            <w:hideMark/>
+          </w:tcPr>
+          <w:p>
+            <w:r>
+              <w:t>no</w:t>
+            </w:r>
+          </w:p>
+        </w:tc>
+      </w:tr>
+      <w:tr>
+        <w:trPr>
+          <w:trHeight w:val="288"/>
+        </w:trPr>
+        <w:tc>
+          <w:tcPr>
+            <w:tcW w:w="4120" w:type="dxa"/>
+            <w:noWrap/>
+            <w:hideMark/>
+          </w:tcPr>
+          <w:p>
+            <w:r>
+              <w:t>Yellow-billed Loon</w:t>
+            </w:r>
+          </w:p>
+        </w:tc>
+        <w:tc>
+          <w:tcPr>
+            <w:tcW w:w="4160" w:type="dxa"/>
+            <w:noWrap/>
+            <w:hideMark/>
+          </w:tcPr>
+          <w:p>
+            <w:r>
+              <w:t xml:space="preserve">Gavia </w:t>
+            </w:r>
+            <w:proofErr w:type="spellStart"/>
+            <w:r>
+              <w:t>adamsii</w:t>
+            </w:r>
+            <w:proofErr w:type="spellEnd"/>
+          </w:p>
+        </w:tc>
+        <w:tc>
+          <w:tcPr>
+            <w:tcW w:w="987" w:type="dxa"/>
+            <w:noWrap/>
+            <w:hideMark/>
+          </w:tcPr>
+          <w:p>
+            <w:r>
+              <w:t>NA</w:t>
+            </w:r>
+          </w:p>
+        </w:tc>
+        <w:tc>
+          <w:tcPr>
+            <w:tcW w:w="965" w:type="dxa"/>
+            <w:noWrap/>
+            <w:hideMark/>
+          </w:tcPr>
+          <w:p>
+            <w:r>
+              <w:t>no</w:t>
+            </w:r>
+          </w:p>
+        </w:tc>
+      </w:tr>
+    </w:tbl>
+    <w:p/>
     <w:p/>
     <w:sectPr>
       <w:pgSz w:w="12240" w:h="15840"/>
@@ -58723,7 +61551,6 @@
   <w:style w:type="character" w:default="1" w:styleId="DefaultParagraphFont">
     <w:name w:val="Default Paragraph Font"/>
     <w:uiPriority w:val="1"/>
-    <w:semiHidden/>
     <w:unhideWhenUsed/>
   </w:style>
   <w:style w:type="table" w:default="1" w:styleId="TableNormal">

</xml_diff>